<commit_message>
remove hapus semua in belum dibaca page
</commit_message>
<xml_diff>
--- a/SistemBeritaAcara.Web/wwwroot/files/documents/ba-15-draft.docx
+++ b/SistemBeritaAcara.Web/wwwroot/files/documents/ba-15-draft.docx
@@ -1,18 +1,18 @@
 
 <file path=word/document.xml><?xml version="1.0" encoding="utf-8"?>
-<w:document xmlns:wpc="http://schemas.microsoft.com/office/word/2010/wordprocessingCanvas" xmlns:cx="http://schemas.microsoft.com/office/drawing/2014/chartex" xmlns:cx1="http://schemas.microsoft.com/office/drawing/2015/9/8/chartex" xmlns:cx2="http://schemas.microsoft.com/office/drawing/2015/10/21/chartex" xmlns:cx3="http://schemas.microsoft.com/office/drawing/2016/5/9/chartex" xmlns:cx4="http://schemas.microsoft.com/office/drawing/2016/5/10/chartex" xmlns:cx5="http://schemas.microsoft.com/office/drawing/2016/5/11/chartex" xmlns:mc="http://schemas.openxmlformats.org/markup-compatibility/2006" xmlns:o="urn:schemas-microsoft-com:office:office" xmlns:r="http://schemas.openxmlformats.org/officeDocument/2006/relationships" xmlns:m="http://schemas.openxmlformats.org/officeDocument/2006/math" xmlns:v="urn:schemas-microsoft-com:vml" xmlns:wp14="http://schemas.microsoft.com/office/word/2010/wordprocessingDrawing" xmlns:wp="http://schemas.openxmlformats.org/drawingml/2006/wordprocessingDrawing" xmlns:w10="urn:schemas-microsoft-com:office:word" xmlns:w="http://schemas.openxmlformats.org/wordprocessingml/2006/main" xmlns:w14="http://schemas.microsoft.com/office/word/2010/wordml" xmlns:w15="http://schemas.microsoft.com/office/word/2012/wordml" xmlns:wne="http://schemas.microsoft.com/office/word/2006/wordml" xmlns:wpg="http://schemas.microsoft.com/office/word/2010/wordprocessingGroup" xmlns:wpi="http://schemas.microsoft.com/office/word/2010/wordprocessingInk" xmlns:wps="http://schemas.microsoft.com/office/word/2010/wordprocessingShape" mc:Ignorable="w14 w15 wp14">
+<w:document xmlns:a="http://schemas.openxmlformats.org/drawingml/2006/main" xmlns:pic="http://schemas.openxmlformats.org/drawingml/2006/picture" xmlns:a14="http://schemas.microsoft.com/office/drawing/2010/main" xmlns:wpc="http://schemas.microsoft.com/office/word/2010/wordprocessingCanvas" xmlns:cx="http://schemas.microsoft.com/office/drawing/2014/chartex" xmlns:cx1="http://schemas.microsoft.com/office/drawing/2015/9/8/chartex" xmlns:cx2="http://schemas.microsoft.com/office/drawing/2015/10/21/chartex" xmlns:cx3="http://schemas.microsoft.com/office/drawing/2016/5/9/chartex" xmlns:cx4="http://schemas.microsoft.com/office/drawing/2016/5/10/chartex" xmlns:cx5="http://schemas.microsoft.com/office/drawing/2016/5/11/chartex" xmlns:mc="http://schemas.openxmlformats.org/markup-compatibility/2006" xmlns:o="urn:schemas-microsoft-com:office:office" xmlns:r="http://schemas.openxmlformats.org/officeDocument/2006/relationships" xmlns:m="http://schemas.openxmlformats.org/officeDocument/2006/math" xmlns:v="urn:schemas-microsoft-com:vml" xmlns:wp14="http://schemas.microsoft.com/office/word/2010/wordprocessingDrawing" xmlns:wp="http://schemas.openxmlformats.org/drawingml/2006/wordprocessingDrawing" xmlns:w10="urn:schemas-microsoft-com:office:word" xmlns:w="http://schemas.openxmlformats.org/wordprocessingml/2006/main" xmlns:w14="http://schemas.microsoft.com/office/word/2010/wordml" xmlns:w15="http://schemas.microsoft.com/office/word/2012/wordml" xmlns:wne="http://schemas.microsoft.com/office/word/2006/wordml" xmlns:wpg="http://schemas.microsoft.com/office/word/2010/wordprocessingGroup" xmlns:wpi="http://schemas.microsoft.com/office/word/2010/wordprocessingInk" xmlns:wps="http://schemas.microsoft.com/office/word/2010/wordprocessingShape" mc:Ignorable="w14 w15 wp14">
   <w:body>
     <w:tbl>
       <w:tblPr>
         <w:tblStyle w:val="TableGrid"/>
         <w:tblW w:w="0" w:type="auto"/>
         <w:tblBorders>
-          <w:top w:val="none" w:sz="0" w:space="0" w:color="auto"/>
-          <w:left w:val="none" w:sz="0" w:space="0" w:color="auto"/>
-          <w:bottom w:val="none" w:sz="0" w:space="0" w:color="auto"/>
-          <w:right w:val="none" w:sz="0" w:space="0" w:color="auto"/>
-          <w:insideH w:val="none" w:sz="0" w:space="0" w:color="auto"/>
-          <w:insideV w:val="none" w:sz="0" w:space="0" w:color="auto"/>
+          <w:top w:val="none" w:color="auto" w:sz="0" w:space="0"/>
+          <w:left w:val="none" w:color="auto" w:sz="0" w:space="0"/>
+          <w:bottom w:val="none" w:color="auto" w:sz="0" w:space="0"/>
+          <w:right w:val="none" w:color="auto" w:sz="0" w:space="0"/>
+          <w:insideH w:val="none" w:color="auto" w:sz="0" w:space="0"/>
+          <w:insideV w:val="none" w:color="auto" w:sz="0" w:space="0"/>
         </w:tblBorders>
         <w:tblLook w:val="04A0"/>
       </w:tblPr>
@@ -25,12 +25,12 @@
         <w:tblPrEx>
           <w:tblW w:w="0" w:type="auto"/>
           <w:tblBorders>
-            <w:top w:val="none" w:sz="0" w:space="0" w:color="auto"/>
-            <w:left w:val="none" w:sz="0" w:space="0" w:color="auto"/>
-            <w:bottom w:val="none" w:sz="0" w:space="0" w:color="auto"/>
-            <w:right w:val="none" w:sz="0" w:space="0" w:color="auto"/>
-            <w:insideH w:val="none" w:sz="0" w:space="0" w:color="auto"/>
-            <w:insideV w:val="none" w:sz="0" w:space="0" w:color="auto"/>
+            <w:top w:val="none" w:color="auto" w:sz="0" w:space="0"/>
+            <w:left w:val="none" w:color="auto" w:sz="0" w:space="0"/>
+            <w:bottom w:val="none" w:color="auto" w:sz="0" w:space="0"/>
+            <w:right w:val="none" w:color="auto" w:sz="0" w:space="0"/>
+            <w:insideH w:val="none" w:color="auto" w:sz="0" w:space="0"/>
+            <w:insideV w:val="none" w:color="auto" w:sz="0" w:space="0"/>
           </w:tblBorders>
           <w:tblLook w:val="04A0"/>
         </w:tblPrEx>
@@ -238,8 +238,8 @@
               <w:tblStyle w:val="TableGrid"/>
               <w:tblW w:w="0" w:type="auto"/>
               <w:tblBorders>
-                <w:insideH w:val="none" w:sz="0" w:space="0" w:color="auto"/>
-                <w:insideV w:val="none" w:sz="0" w:space="0" w:color="auto"/>
+                <w:insideH w:val="none" w:color="auto" w:sz="0" w:space="0"/>
+                <w:insideV w:val="none" w:color="auto" w:sz="0" w:space="0"/>
               </w:tblBorders>
               <w:tblLook w:val="04A0"/>
             </w:tblPr>
@@ -252,8 +252,8 @@
               <w:tblPrEx>
                 <w:tblW w:w="0" w:type="auto"/>
                 <w:tblBorders>
-                  <w:insideH w:val="none" w:sz="0" w:space="0" w:color="auto"/>
-                  <w:insideV w:val="none" w:sz="0" w:space="0" w:color="auto"/>
+                  <w:insideH w:val="none" w:color="auto" w:sz="0" w:space="0"/>
+                  <w:insideV w:val="none" w:color="auto" w:sz="0" w:space="0"/>
                 </w:tblBorders>
                 <w:tblLook w:val="04A0"/>
               </w:tblPrEx>
@@ -1500,7 +1500,7 @@
           <w:tcPr>
             <w:tcW w:w="805" w:type="dxa"/>
             <w:tcBorders>
-              <w:bottom w:val="single" w:sz="4" w:space="0" w:color="auto"/>
+              <w:bottom w:val="single" w:color="auto" w:sz="4" w:space="0"/>
             </w:tcBorders>
           </w:tcPr>
           <w:tbl>
@@ -1508,12 +1508,12 @@
               <w:tblStyle w:val="TableGrid"/>
               <w:tblW w:w="0" w:type="auto"/>
               <w:tblBorders>
-                <w:top w:val="none" w:sz="0" w:space="0" w:color="auto"/>
-                <w:left w:val="none" w:sz="0" w:space="0" w:color="auto"/>
-                <w:bottom w:val="none" w:sz="0" w:space="0" w:color="auto"/>
-                <w:right w:val="none" w:sz="0" w:space="0" w:color="auto"/>
-                <w:insideH w:val="none" w:sz="0" w:space="0" w:color="auto"/>
-                <w:insideV w:val="none" w:sz="0" w:space="0" w:color="auto"/>
+                <w:top w:val="none" w:color="auto" w:sz="0" w:space="0"/>
+                <w:left w:val="none" w:color="auto" w:sz="0" w:space="0"/>
+                <w:bottom w:val="none" w:color="auto" w:sz="0" w:space="0"/>
+                <w:right w:val="none" w:color="auto" w:sz="0" w:space="0"/>
+                <w:insideH w:val="none" w:color="auto" w:sz="0" w:space="0"/>
+                <w:insideV w:val="none" w:color="auto" w:sz="0" w:space="0"/>
               </w:tblBorders>
               <w:tblLayout w:type="fixed"/>
               <w:tblLook w:val="04A0"/>
@@ -1525,12 +1525,12 @@
               <w:tblPrEx>
                 <w:tblW w:w="0" w:type="auto"/>
                 <w:tblBorders>
-                  <w:top w:val="none" w:sz="0" w:space="0" w:color="auto"/>
-                  <w:left w:val="none" w:sz="0" w:space="0" w:color="auto"/>
-                  <w:bottom w:val="none" w:sz="0" w:space="0" w:color="auto"/>
-                  <w:right w:val="none" w:sz="0" w:space="0" w:color="auto"/>
-                  <w:insideH w:val="none" w:sz="0" w:space="0" w:color="auto"/>
-                  <w:insideV w:val="none" w:sz="0" w:space="0" w:color="auto"/>
+                  <w:top w:val="none" w:color="auto" w:sz="0" w:space="0"/>
+                  <w:left w:val="none" w:color="auto" w:sz="0" w:space="0"/>
+                  <w:bottom w:val="none" w:color="auto" w:sz="0" w:space="0"/>
+                  <w:right w:val="none" w:color="auto" w:sz="0" w:space="0"/>
+                  <w:insideH w:val="none" w:color="auto" w:sz="0" w:space="0"/>
+                  <w:insideV w:val="none" w:color="auto" w:sz="0" w:space="0"/>
                 </w:tblBorders>
                 <w:tblLayout w:type="fixed"/>
                 <w:tblLook w:val="04A0"/>
@@ -1644,12 +1644,12 @@
               <w:tblStyle w:val="TableGrid"/>
               <w:tblW w:w="0" w:type="auto"/>
               <w:tblBorders>
-                <w:top w:val="none" w:sz="0" w:space="0" w:color="auto"/>
-                <w:left w:val="none" w:sz="0" w:space="0" w:color="auto"/>
-                <w:bottom w:val="none" w:sz="0" w:space="0" w:color="auto"/>
-                <w:right w:val="none" w:sz="0" w:space="0" w:color="auto"/>
-                <w:insideH w:val="none" w:sz="0" w:space="0" w:color="auto"/>
-                <w:insideV w:val="none" w:sz="0" w:space="0" w:color="auto"/>
+                <w:top w:val="none" w:color="auto" w:sz="0" w:space="0"/>
+                <w:left w:val="none" w:color="auto" w:sz="0" w:space="0"/>
+                <w:bottom w:val="none" w:color="auto" w:sz="0" w:space="0"/>
+                <w:right w:val="none" w:color="auto" w:sz="0" w:space="0"/>
+                <w:insideH w:val="none" w:color="auto" w:sz="0" w:space="0"/>
+                <w:insideV w:val="none" w:color="auto" w:sz="0" w:space="0"/>
               </w:tblBorders>
               <w:tblLayout w:type="fixed"/>
               <w:tblLook w:val="04A0"/>
@@ -1662,12 +1662,12 @@
               <w:tblPrEx>
                 <w:tblW w:w="0" w:type="auto"/>
                 <w:tblBorders>
-                  <w:top w:val="none" w:sz="0" w:space="0" w:color="auto"/>
-                  <w:left w:val="none" w:sz="0" w:space="0" w:color="auto"/>
-                  <w:bottom w:val="none" w:sz="0" w:space="0" w:color="auto"/>
-                  <w:right w:val="none" w:sz="0" w:space="0" w:color="auto"/>
-                  <w:insideH w:val="none" w:sz="0" w:space="0" w:color="auto"/>
-                  <w:insideV w:val="none" w:sz="0" w:space="0" w:color="auto"/>
+                  <w:top w:val="none" w:color="auto" w:sz="0" w:space="0"/>
+                  <w:left w:val="none" w:color="auto" w:sz="0" w:space="0"/>
+                  <w:bottom w:val="none" w:color="auto" w:sz="0" w:space="0"/>
+                  <w:right w:val="none" w:color="auto" w:sz="0" w:space="0"/>
+                  <w:insideH w:val="none" w:color="auto" w:sz="0" w:space="0"/>
+                  <w:insideV w:val="none" w:color="auto" w:sz="0" w:space="0"/>
                 </w:tblBorders>
                 <w:tblLayout w:type="fixed"/>
                 <w:tblLook w:val="04A0"/>
@@ -1836,7 +1836,7 @@
           <w:tcPr>
             <w:tcW w:w="1170" w:type="dxa"/>
             <w:tcBorders>
-              <w:bottom w:val="single" w:sz="4" w:space="0" w:color="auto"/>
+              <w:bottom w:val="single" w:color="auto" w:sz="4" w:space="0"/>
             </w:tcBorders>
           </w:tcPr>
           <w:p>
@@ -1883,7 +1883,7 @@
           <w:tcPr>
             <w:tcW w:w="2250" w:type="dxa"/>
             <w:tcBorders>
-              <w:bottom w:val="single" w:sz="4" w:space="0" w:color="auto"/>
+              <w:bottom w:val="single" w:color="auto" w:sz="4" w:space="0"/>
             </w:tcBorders>
           </w:tcPr>
           <w:p>
@@ -1930,7 +1930,7 @@
           <w:tcPr>
             <w:tcW w:w="2973" w:type="dxa"/>
             <w:tcBorders>
-              <w:bottom w:val="single" w:sz="4" w:space="0" w:color="auto"/>
+              <w:bottom w:val="single" w:color="auto" w:sz="4" w:space="0"/>
             </w:tcBorders>
           </w:tcPr>
           <w:p>
@@ -2469,12 +2469,12 @@
         <w:tblW w:w="0" w:type="auto"/>
         <w:tblInd w:w="360" w:type="dxa"/>
         <w:tblBorders>
-          <w:top w:val="none" w:sz="0" w:space="0" w:color="auto"/>
-          <w:left w:val="none" w:sz="0" w:space="0" w:color="auto"/>
-          <w:bottom w:val="none" w:sz="0" w:space="0" w:color="auto"/>
-          <w:right w:val="none" w:sz="0" w:space="0" w:color="auto"/>
-          <w:insideH w:val="none" w:sz="0" w:space="0" w:color="auto"/>
-          <w:insideV w:val="none" w:sz="0" w:space="0" w:color="auto"/>
+          <w:top w:val="none" w:color="auto" w:sz="0" w:space="0"/>
+          <w:left w:val="none" w:color="auto" w:sz="0" w:space="0"/>
+          <w:bottom w:val="none" w:color="auto" w:sz="0" w:space="0"/>
+          <w:right w:val="none" w:color="auto" w:sz="0" w:space="0"/>
+          <w:insideH w:val="none" w:color="auto" w:sz="0" w:space="0"/>
+          <w:insideV w:val="none" w:color="auto" w:sz="0" w:space="0"/>
         </w:tblBorders>
         <w:tblLook w:val="04A0"/>
       </w:tblPr>
@@ -2488,12 +2488,12 @@
           <w:tblW w:w="0" w:type="auto"/>
           <w:tblInd w:w="360" w:type="dxa"/>
           <w:tblBorders>
-            <w:top w:val="none" w:sz="0" w:space="0" w:color="auto"/>
-            <w:left w:val="none" w:sz="0" w:space="0" w:color="auto"/>
-            <w:bottom w:val="none" w:sz="0" w:space="0" w:color="auto"/>
-            <w:right w:val="none" w:sz="0" w:space="0" w:color="auto"/>
-            <w:insideH w:val="none" w:sz="0" w:space="0" w:color="auto"/>
-            <w:insideV w:val="none" w:sz="0" w:space="0" w:color="auto"/>
+            <w:top w:val="none" w:color="auto" w:sz="0" w:space="0"/>
+            <w:left w:val="none" w:color="auto" w:sz="0" w:space="0"/>
+            <w:bottom w:val="none" w:color="auto" w:sz="0" w:space="0"/>
+            <w:right w:val="none" w:color="auto" w:sz="0" w:space="0"/>
+            <w:insideH w:val="none" w:color="auto" w:sz="0" w:space="0"/>
+            <w:insideV w:val="none" w:color="auto" w:sz="0" w:space="0"/>
           </w:tblBorders>
           <w:tblLook w:val="04A0"/>
         </w:tblPrEx>
@@ -2635,7 +2635,7 @@
             </w:pPr>
             <w:r>
               <w:pict>
-                <v:shapetype id="_x0000_t75" coordsize="21600,21600" o:spt="75" o:preferrelative="t" path="m@4@5l@4@11@9@11@9@5xe" filled="f" stroked="f">
+                <v:shapetype id="_x0000_t75" coordsize="21600,21600" filled="f" stroked="f" o:spt="75" o:preferrelative="t" path="m@4@5l@4@11@9@11@9@5xe">
                   <v:stroke joinstyle="miter"/>
                   <v:formulas>
                     <v:f eqn="if lineDrawn pixelLineWidth 0"/>
@@ -2651,11 +2651,11 @@
                     <v:f eqn="prod @7 21600 pixelHeight"/>
                     <v:f eqn="sum @10 21600 0"/>
                   </v:formulas>
-                  <v:path o:extrusionok="f" gradientshapeok="t" o:connecttype="rect"/>
+                  <v:path gradientshapeok="t" o:connecttype="rect" o:extrusionok="f"/>
                   <o:lock v:ext="edit" aspectratio="t"/>
                 </v:shapetype>
-                <v:shape id="_x0000_i1025" type="#_x0000_t75" style="width:166.67pt;height:50pt">
-                  <v:imagedata r:id="rId4" o:title=""/>
+                <v:shape id="_x0000_i1025" style="width:166.67pt;height:50pt" type="#_x0000_t75">
+                  <v:imagedata o:title="" r:id="rId4"/>
                 </v:shape>
               </w:pict>
             </w:r>
@@ -2696,8 +2696,8 @@
             </w:pPr>
             <w:r>
               <w:pict>
-                <v:shape id="_x0000_i1026" type="#_x0000_t75" style="width:166.67pt;height:50pt">
-                  <v:imagedata r:id="rId5" o:title=""/>
+                <v:shape id="_x0000_i1026" style="width:166.67pt;height:50pt" type="#_x0000_t75">
+                  <v:imagedata o:title="" r:id="rId5"/>
                 </v:shape>
               </w:pict>
             </w:r>
@@ -2738,8 +2738,8 @@
             </w:pPr>
             <w:r>
               <w:pict>
-                <v:shape id="_x0000_i1027" type="#_x0000_t75" style="width:200pt;height:50pt">
-                  <v:imagedata r:id="rId6" o:title=""/>
+                <v:shape id="_x0000_i1027" style="width:200pt;height:50pt" type="#_x0000_t75">
+                  <v:imagedata o:title="" r:id="rId6"/>
                 </v:shape>
               </w:pict>
             </w:r>
@@ -2987,7 +2987,7 @@
     <w:sectPr>
       <w:pgSz w:w="11906" w:h="16838" w:orient="portrait" w:code="9"/>
       <w:pgMar w:top="1134" w:right="1134" w:bottom="1134" w:left="1134" w:header="720" w:footer="720" w:gutter="0"/>
-      <w:cols w:num="1" w:space="720">
+      <w:cols w:space="720" w:num="1">
         <w:col w:w="9638" w:space="720"/>
       </w:cols>
       <w:docGrid w:linePitch="360"/>

</xml_diff>